<commit_message>
Mensajes CM: respuesta a Kimberly con tarifa escalonada y prueba practica
Co-Authored-By: Claude Fable 5.1 <noreply@anthropic.com>
</commit_message>
<xml_diff>
--- a/recursos/comercial/contratacion/COMMUNITY_MANAGER/MENSAJES_CANDIDATOS_CM_SIGUIENTE_PASO.docx
+++ b/recursos/comercial/contratacion/COMMUNITY_MANAGER/MENSAJES_CANDIDATOS_CM_SIGUIENTE_PASO.docx
@@ -257,6 +257,48 @@
           <w:sz w:val="22"/>
         </w:rPr>
         <w:t xml:space="preserve"> de 2 Reels y los 2 Reels editados, 5 historias y 1 testimonio corto de un estudiante. Así nos conocemos trabajando. ¡Quedamos atentos!</w:t>
+      </w:r>
+    </w:p>
+    <w:p/>
+    <w:p>
+      <w:r>
+        <w:rPr>
+          <w:b/>
+          <w:color w:val="E54C09"/>
+          <w:sz w:val="24"/>
+        </w:rPr>
+        <w:t>RESPUESTA A KIMBERLY — 12/10/2026 (adjuntar BRIEF_PRUEBA_PRACTICA_CM.docx)</w:t>
+      </w:r>
+    </w:p>
+    <w:p>
+      <w:r>
+        <w:rPr>
+          <w:sz w:val="21"/>
+        </w:rPr>
+        <w:t>Hola Kimberly, gracias por la respuesta tan completa. Cumples con lo que necesitamos en ubicación, equipo, disponibilidad y proceso creativo.</w:t>
+        <w:br/>
+        <w:br/>
+        <w:t>Sobre la tarifa: el inicio es de $1.800.000 por las dos marcas, con revisión al tercer mes. Si se cumplen los mínimos acordados, desde el cuarto mes la tarifa pasa a $2.000.000. Preferimos que el aumento vaya atado a resultados, igual que todo en la academia.</w:t>
+        <w:br/>
+        <w:br/>
+        <w:t>El siguiente paso es la prueba práctica pagada ($100.000): ejecutar uno de nuestros guiones de anuncio, grabado desde tu casa, con las mismas reglas de entrega que usa nuestro videógrafo. Te adjunto el brief completo. Ahí verás que nuestro mensaje es distinto al habitual: no vendemos que el inglés sea fácil ni divertido, vendemos entrenamiento con garantía por escrito. Queremos ver cómo lo ejecutas.</w:t>
+        <w:br/>
+        <w:br/>
+        <w:t>¿Me confirmas si te animas y para cuándo la tendrías?</w:t>
+        <w:br/>
+        <w:br/>
+        <w:t>Diana Gómez</w:t>
+        <w:br/>
+        <w:t>Gerente General, Heiiu English Academy</w:t>
+      </w:r>
+    </w:p>
+    <w:p>
+      <w:r>
+        <w:rPr>
+          <w:color w:val="666666"/>
+          <w:sz w:val="19"/>
+        </w:rPr>
+        <w:t>Para Sebastián, cuando responda: mismo brief y misma prueba; se comparan las dos entregas con la rúbrica de 7 criterios del brief. La prueba se paga igual si pasa o no.</w:t>
       </w:r>
     </w:p>
     <w:sectPr>

</xml_diff>